<commit_message>
Apply Nature review major revisions
</commit_message>
<xml_diff>
--- a/paper/manuscript/SUPPLEMENTARY.docx
+++ b/paper/manuscript/SUPPLEMENTARY.docx
@@ -2,7 +2,7 @@
 <file path=word/document.xml><?xml version="1.0" encoding="utf-8"?>
 <w:document xmlns:w="http://schemas.openxmlformats.org/wordprocessingml/2006/main" xmlns:m="http://schemas.openxmlformats.org/officeDocument/2006/math" xmlns:r="http://schemas.openxmlformats.org/officeDocument/2006/relationships" xmlns:o="urn:schemas-microsoft-com:office:office" xmlns:v="urn:schemas-microsoft-com:vml" xmlns:w10="urn:schemas-microsoft-com:office:word" xmlns:a="http://schemas.openxmlformats.org/drawingml/2006/main" xmlns:pic="http://schemas.openxmlformats.org/drawingml/2006/picture" xmlns:wp="http://schemas.openxmlformats.org/drawingml/2006/wordprocessingDrawing">
   <w:body>
-    <w:bookmarkStart w:id="36" w:name="Xc3fcc6656da83e08d67075bda016bbdc5c3d5f9"/>
+    <w:bookmarkStart w:id="38" w:name="Xc3fcc6656da83e08d67075bda016bbdc5c3d5f9"/>
     <w:p>
       <w:pPr>
         <w:pStyle w:val="Heading1"/>
@@ -120,13 +120,13 @@
       </w:r>
     </w:p>
     <w:bookmarkEnd w:id="9"/>
-    <w:bookmarkStart w:id="10" w:name="Xc212d59051500608a6a292fa9e7516d81d06b47"/>
+    <w:bookmarkStart w:id="10" w:name="Xfef0c61f0d1223d6251568178299c1876716186"/>
     <w:p>
       <w:pPr>
         <w:pStyle w:val="Heading2"/>
       </w:pPr>
       <w:r>
-        <w:t xml:space="preserve">Supplementary Figure S2 — Held-out GTDB-R207 benchmark (v5 detail)</w:t>
+        <w:t xml:space="preserve">Supplementary Figure S2 — Held-out GTDB-R207 benchmark (v6 detail)</w:t>
       </w:r>
     </w:p>
     <w:p>
@@ -169,13 +169,13 @@
         <w:t xml:space="preserve"> </w:t>
       </w:r>
       <w:r>
-        <w:t xml:space="preserve">gate, consistency flag, and calibration v5 were frozen before evaluation.</w:t>
-      </w:r>
-      <w:r>
-        <w:t xml:space="preserve"> </w:t>
-      </w:r>
-      <w:r>
-        <w:t xml:space="preserve">Panels (a–c) Calibrated Syn2bANI v5, skani, and FastANI vs ANIm (MAE 0.619, 0.958, 0.977 respectively). (d) Per-band MAE. (e) Signed-error distributions: skani and FastANI carry a large negative bias at divergent bands; the calibrated estimator is centered (bias −0.12). Per-pair truth, tool output, per-band and per-phylum metrics:</w:t>
+        <w:t xml:space="preserve">gate, consistency flag, and benchmark calibration v6 were frozen before evaluation.</w:t>
+      </w:r>
+      <w:r>
+        <w:t xml:space="preserve"> </w:t>
+      </w:r>
+      <w:r>
+        <w:t xml:space="preserve">Panels (a–c) Calibrated Syn2bANI v6, skani, and FastANI vs ANIm (MAE 0.619, 0.958, 0.977 respectively). (d) Per-band MAE. (e) Signed-error distributions: skani and FastANI carry a large negative bias at divergent bands; the calibrated estimator is centered (bias −0.12). Per-pair truth, tool output, per-band and per-phylum metrics:</w:t>
       </w:r>
       <w:r>
         <w:t xml:space="preserve"> </w:t>
@@ -320,7 +320,7 @@
         <w:t xml:space="preserve"> </w:t>
       </w:r>
       <w:r>
-        <w:t xml:space="preserve">Calibrated Syn2bANI v5 overall MAE = 0.619, Pearson r = 0.962. (a) MAE by</w:t>
+        <w:t xml:space="preserve">Calibrated Syn2bANI v6 overall MAE = 0.619, Pearson r = 0.962. (a) MAE by</w:t>
       </w:r>
       <w:r>
         <w:t xml:space="preserve"> </w:t>
@@ -557,59 +557,13 @@
       </w:r>
     </w:p>
     <w:bookmarkEnd w:id="15"/>
-    <w:bookmarkStart w:id="16" w:name="X395fcc4879aa2caa98aa8b4904a4197641f6244"/>
+    <w:bookmarkStart w:id="16" w:name="Xd28721eaf45ab078b62d0bd078fa512bc083676"/>
     <w:p>
       <w:pPr>
         <w:pStyle w:val="Heading2"/>
       </w:pPr>
       <w:r>
-        <w:t xml:space="preserve">Supplementary Figure S8 — High-ANI isolate collections show extensive rearrangements</w:t>
-      </w:r>
-    </w:p>
-    <w:p>
-      <w:pPr>
-        <w:pStyle w:val="FirstParagraph"/>
-      </w:pPr>
-      <w:r>
-        <w:t xml:space="preserve">(</w:t>
-      </w:r>
-      <w:r>
-        <w:rPr>
-          <w:rStyle w:val="VerbatimChar"/>
-        </w:rPr>
-        <w:t xml:space="preserve">paper/figures/supplementary/fig_s8_syntracker_breakpoints.png</w:t>
-      </w:r>
-      <w:r>
-        <w:t xml:space="preserve">)</w:t>
-      </w:r>
-    </w:p>
-    <w:p>
-      <w:pPr>
-        <w:pStyle w:val="BodyText"/>
-      </w:pPr>
-      <w:r>
-        <w:t xml:space="preserve">skani ANI versus Syn2bANI</w:t>
-      </w:r>
-      <w:r>
-        <w:t xml:space="preserve"> </w:t>
-      </w:r>
-      <w:r>
-        <w:rPr>
-          <w:rStyle w:val="VerbatimChar"/>
-        </w:rPr>
-        <w:t xml:space="preserve">breakpoint_count</w:t>
-      </w:r>
-      <w:r>
-        <w:t xml:space="preserve"> </w:t>
-      </w:r>
-      <w:r>
-        <w:t xml:space="preserve">for four published near-clonal</w:t>
-      </w:r>
-      <w:r>
-        <w:t xml:space="preserve"> </w:t>
-      </w:r>
-      <w:r>
-        <w:t xml:space="preserve">isolate collections: (a)</w:t>
+        <w:t xml:space="preserve">Supplementary Figure S8 —</w:t>
       </w:r>
       <w:r>
         <w:t xml:space="preserve"> </w:t>
@@ -619,13 +573,38 @@
           <w:i/>
           <w:iCs/>
         </w:rPr>
-        <w:t xml:space="preserve">E. coli</w:t>
-      </w:r>
-      <w:r>
-        <w:t xml:space="preserve"> </w:t>
-      </w:r>
-      <w:r>
-        <w:t xml:space="preserve">hypermutator (253 pairs), (b)</w:t>
+        <w:t xml:space="preserve">H. pylori</w:t>
+      </w:r>
+      <w:r>
+        <w:t xml:space="preserve"> </w:t>
+      </w:r>
+      <w:r>
+        <w:t xml:space="preserve">junction counts resolve by participant</w:t>
+      </w:r>
+    </w:p>
+    <w:p>
+      <w:pPr>
+        <w:pStyle w:val="FirstParagraph"/>
+      </w:pPr>
+      <w:r>
+        <w:t xml:space="preserve">(</w:t>
+      </w:r>
+      <w:r>
+        <w:rPr>
+          <w:rStyle w:val="VerbatimChar"/>
+        </w:rPr>
+        <w:t xml:space="preserve">paper/figures/supplementary/fig_s8_syntracker_h_pylori_by_host.png</w:t>
+      </w:r>
+      <w:r>
+        <w:t xml:space="preserve">)</w:t>
+      </w:r>
+    </w:p>
+    <w:p>
+      <w:pPr>
+        <w:pStyle w:val="BodyText"/>
+      </w:pPr>
+      <w:r>
+        <w:t xml:space="preserve">The</w:t>
       </w:r>
       <w:r>
         <w:t xml:space="preserve"> </w:t>
@@ -641,7 +620,31 @@
         <w:t xml:space="preserve"> </w:t>
       </w:r>
       <w:r>
-        <w:t xml:space="preserve">(2,926 pairs), (c)</w:t>
+        <w:t xml:space="preserve">panel of Fig. 6 coloured by the participant each isolate came</w:t>
+      </w:r>
+      <w:r>
+        <w:t xml:space="preserve"> </w:t>
+      </w:r>
+      <w:r>
+        <w:t xml:space="preserve">from, 2,926 pairs scored with the Syn2b structural channel. Same-participant</w:t>
+      </w:r>
+      <w:r>
+        <w:t xml:space="preserve"> </w:t>
+      </w:r>
+      <w:r>
+        <w:t xml:space="preserve">pairs sit at the zero floor (median 0 junctions, n = 476); different-participant</w:t>
+      </w:r>
+      <w:r>
+        <w:t xml:space="preserve"> </w:t>
+      </w:r>
+      <w:r>
+        <w:t xml:space="preserve">pairs carry a median of 8 (n = 2,450; Mann–Whitney p = 4.1 × 10⁻²²⁶). The</w:t>
+      </w:r>
+      <w:r>
+        <w:t xml:space="preserve"> </w:t>
+      </w:r>
+      <w:r>
+        <w:t xml:space="preserve">cohort-level medians are 0 (hypermutator</w:t>
       </w:r>
       <w:r>
         <w:t xml:space="preserve"> </w:t>
@@ -651,136 +654,180 @@
           <w:i/>
           <w:iCs/>
         </w:rPr>
-        <w:t xml:space="preserve">N. gonorrhoeae</w:t>
-      </w:r>
-      <w:r>
-        <w:t xml:space="preserve"> </w:t>
-      </w:r>
-      <w:r>
-        <w:t xml:space="preserve">(66 pairs), and (d)</w:t>
-      </w:r>
-      <w:r>
-        <w:t xml:space="preserve"> </w:t>
+        <w:t xml:space="preserve">E. coli</w:t>
+      </w:r>
+      <w:r>
+        <w:t xml:space="preserve">), 3 (</w:t>
       </w:r>
       <w:r>
         <w:rPr>
           <w:i/>
           <w:iCs/>
         </w:rPr>
-        <w:t xml:space="preserve">S. rimosus</w:t>
-      </w:r>
-      <w:r>
-        <w:t xml:space="preserve"> </w:t>
-      </w:r>
-      <w:r>
-        <w:t xml:space="preserve">(190</w:t>
-      </w:r>
-      <w:r>
-        <w:t xml:space="preserve"> </w:t>
-      </w:r>
-      <w:r>
-        <w:t xml:space="preserve">pairs). In all four collections ANI is pinned near 100% while breakpoint counts</w:t>
-      </w:r>
-      <w:r>
-        <w:t xml:space="preserve"> </w:t>
-      </w:r>
-      <w:r>
-        <w:t xml:space="preserve">vary over orders of magnitude.</w:t>
-      </w:r>
-    </w:p>
-    <w:bookmarkEnd w:id="16"/>
-    <w:bookmarkStart w:id="17" w:name="X0901c4e02efe3f664fe55d0ba0a51784ec0ccd3"/>
-    <w:p>
-      <w:pPr>
-        <w:pStyle w:val="Heading2"/>
-      </w:pPr>
-      <w:r>
-        <w:t xml:space="preserve">Supplementary Figure S9 — High-ANI</w:t>
-      </w:r>
-      <w:r>
-        <w:t xml:space="preserve"> </w:t>
+        <w:t xml:space="preserve">N. gonorrhoeae</w:t>
+      </w:r>
+      <w:r>
+        <w:t xml:space="preserve">),</w:t>
+      </w:r>
+      <w:r>
+        <w:t xml:space="preserve"> </w:t>
+      </w:r>
+      <w:r>
+        <w:t xml:space="preserve">7 (</w:t>
       </w:r>
       <w:r>
         <w:rPr>
           <w:i/>
           <w:iCs/>
         </w:rPr>
-        <w:t xml:space="preserve">E. coli</w:t>
-      </w:r>
-      <w:r>
-        <w:t xml:space="preserve"> </w:t>
-      </w:r>
-      <w:r>
-        <w:t xml:space="preserve">O157:H7 pairs carry hundreds of breakpoints</w:t>
-      </w:r>
-    </w:p>
-    <w:p>
-      <w:pPr>
-        <w:pStyle w:val="FirstParagraph"/>
-      </w:pPr>
-      <w:r>
-        <w:t xml:space="preserve">(</w:t>
-      </w:r>
-      <w:r>
-        <w:rPr>
-          <w:rStyle w:val="VerbatimChar"/>
-        </w:rPr>
-        <w:t xml:space="preserve">paper/figures/supplementary/fig_s9_ecoli_o157_breakpoints.png</w:t>
-      </w:r>
-      <w:r>
-        <w:t xml:space="preserve">)</w:t>
-      </w:r>
-    </w:p>
-    <w:p>
-      <w:pPr>
-        <w:pStyle w:val="BodyText"/>
-      </w:pPr>
-      <w:r>
-        <w:t xml:space="preserve">Seventy-four genomes from Fitzgerald et al. (2021), 2,701 non-self pairs.</w:t>
-      </w:r>
-      <w:r>
-        <w:t xml:space="preserve"> </w:t>
-      </w:r>
-      <w:r>
-        <w:t xml:space="preserve">(a) ANI vs breakpoint count colored by lineage (I/II, II, Ia, Ic). (b) Same</w:t>
-      </w:r>
-      <w:r>
-        <w:t xml:space="preserve"> </w:t>
-      </w:r>
-      <w:r>
-        <w:t xml:space="preserve">data colored by host category (bovine, human, other/unknown). All pairwise ANIs</w:t>
-      </w:r>
-      <w:r>
-        <w:t xml:space="preserve"> </w:t>
-      </w:r>
-      <w:r>
-        <w:t xml:space="preserve">exceed 99.886% yet breakpoints range from 171 to &gt;1,100.</w:t>
-      </w:r>
-    </w:p>
-    <w:bookmarkEnd w:id="17"/>
-    <w:bookmarkStart w:id="18" w:name="X3f3356e481db4642ed3127a5f0205142ae48f68"/>
-    <w:p>
-      <w:pPr>
-        <w:pStyle w:val="Heading2"/>
-      </w:pPr>
-      <w:r>
-        <w:t xml:space="preserve">Supplementary Figure S10 — High-ANI FDA-ARGOS</w:t>
-      </w:r>
-      <w:r>
-        <w:t xml:space="preserve"> </w:t>
+        <w:t xml:space="preserve">H. pylori</w:t>
+      </w:r>
+      <w:r>
+        <w:t xml:space="preserve">) and 10 (</w:t>
       </w:r>
       <w:r>
         <w:rPr>
           <w:i/>
           <w:iCs/>
         </w:rPr>
+        <w:t xml:space="preserve">S. rimosus</w:t>
+      </w:r>
+      <w:r>
+        <w:t xml:space="preserve">); see</w:t>
+      </w:r>
+      <w:r>
+        <w:t xml:space="preserve"> </w:t>
+      </w:r>
+      <w:r>
+        <w:rPr>
+          <w:rStyle w:val="VerbatimChar"/>
+        </w:rPr>
+        <w:t xml:space="preserve">results/syntracker_validation/SYNTRACKER_STRUCTURAL_REANALYSIS.md</w:t>
+      </w:r>
+      <w:r>
+        <w:t xml:space="preserve">.</w:t>
+      </w:r>
+    </w:p>
+    <w:bookmarkEnd w:id="16"/>
+    <w:bookmarkStart w:id="17" w:name="Xc20aa30b1c29bb55e1932abb3d59b7bab81099e"/>
+    <w:p>
+      <w:pPr>
+        <w:pStyle w:val="Heading2"/>
+      </w:pPr>
+      <w:r>
+        <w:t xml:space="preserve">Supplementary Figure S9 — Near-clonal</w:t>
+      </w:r>
+      <w:r>
+        <w:t xml:space="preserve"> </w:t>
+      </w:r>
+      <w:r>
+        <w:rPr>
+          <w:i/>
+          <w:iCs/>
+        </w:rPr>
+        <w:t xml:space="preserve">E. coli</w:t>
+      </w:r>
+      <w:r>
+        <w:t xml:space="preserve"> </w:t>
+      </w:r>
+      <w:r>
+        <w:t xml:space="preserve">O157:H7 pairs still differ structurally</w:t>
+      </w:r>
+    </w:p>
+    <w:p>
+      <w:pPr>
+        <w:pStyle w:val="FirstParagraph"/>
+      </w:pPr>
+      <w:r>
+        <w:t xml:space="preserve">(</w:t>
+      </w:r>
+      <w:r>
+        <w:rPr>
+          <w:rStyle w:val="VerbatimChar"/>
+        </w:rPr>
+        <w:t xml:space="preserve">paper/figures/supplementary/fig_s9_ecoli_o157_breakpoints.png</w:t>
+      </w:r>
+      <w:r>
+        <w:t xml:space="preserve">)</w:t>
+      </w:r>
+    </w:p>
+    <w:p>
+      <w:pPr>
+        <w:pStyle w:val="BodyText"/>
+      </w:pPr>
+      <w:r>
+        <w:t xml:space="preserve">Seventy-four complete genomes from Fitzgerald et al. (2021), 2,701 non-self</w:t>
+      </w:r>
+      <w:r>
+        <w:t xml:space="preserve"> </w:t>
+      </w:r>
+      <w:r>
+        <w:t xml:space="preserve">pairs, re-run with Syn2bANI v0.1.1. (a) ANI vs</w:t>
+      </w:r>
+      <w:r>
+        <w:t xml:space="preserve"> </w:t>
+      </w:r>
+      <w:r>
+        <w:rPr>
+          <w:rStyle w:val="VerbatimChar"/>
+        </w:rPr>
+        <w:t xml:space="preserve">breakpoint_count</w:t>
+      </w:r>
+      <w:r>
+        <w:t xml:space="preserve"> </w:t>
+      </w:r>
+      <w:r>
+        <w:t xml:space="preserve">coloured by</w:t>
+      </w:r>
+      <w:r>
+        <w:t xml:space="preserve"> </w:t>
+      </w:r>
+      <w:r>
+        <w:t xml:space="preserve">lineage when both members share one (I/II, II, Ia, Ic; grey = different</w:t>
+      </w:r>
+      <w:r>
+        <w:t xml:space="preserve"> </w:t>
+      </w:r>
+      <w:r>
+        <w:t xml:space="preserve">lineages). (b) The same by host category (bovine, human, other/unknown). Every</w:t>
+      </w:r>
+      <w:r>
+        <w:t xml:space="preserve"> </w:t>
+      </w:r>
+      <w:r>
+        <w:t xml:space="preserve">pairwise ANI exceeds 99.886%, yet the median pair differs by 7 breakpoints</w:t>
+      </w:r>
+      <w:r>
+        <w:t xml:space="preserve"> </w:t>
+      </w:r>
+      <w:r>
+        <w:t xml:space="preserve">(IQR 4–9, max 19) and only 7.1% of pairs are structurally identical.</w:t>
+      </w:r>
+    </w:p>
+    <w:bookmarkEnd w:id="17"/>
+    <w:bookmarkStart w:id="18" w:name="X0a3f85e4c1ab9758b1015ebd481ec6c30f45d0a"/>
+    <w:p>
+      <w:pPr>
+        <w:pStyle w:val="Heading2"/>
+      </w:pPr>
+      <w:r>
+        <w:t xml:space="preserve">Supplementary Figure S10 — The FDA-ARGOS</w:t>
+      </w:r>
+      <w:r>
+        <w:t xml:space="preserve"> </w:t>
+      </w:r>
+      <w:r>
+        <w:rPr>
+          <w:i/>
+          <w:iCs/>
+        </w:rPr>
         <w:t xml:space="preserve">Staphylococcus aureus</w:t>
       </w:r>
       <w:r>
         <w:t xml:space="preserve"> </w:t>
       </w:r>
       <w:r>
-        <w:t xml:space="preserve">pairs show wide breakpoint variation</w:t>
+        <w:t xml:space="preserve">collection is structurally conserved</w:t>
       </w:r>
     </w:p>
     <w:p>
@@ -805,19 +852,64 @@
         <w:pStyle w:val="BodyText"/>
       </w:pPr>
       <w:r>
-        <w:t xml:space="preserve">One hundred and twenty-two genomes, 7,381 refined pairs. (a) ANI vs breakpoint</w:t>
-      </w:r>
-      <w:r>
-        <w:t xml:space="preserve"> </w:t>
-      </w:r>
-      <w:r>
-        <w:t xml:space="preserve">count colored by country. (b) ANI vs breakpoint count colored by isolation</w:t>
-      </w:r>
-      <w:r>
-        <w:t xml:space="preserve"> </w:t>
-      </w:r>
-      <w:r>
-        <w:t xml:space="preserve">source. Pairs at 100% ANI still carry &gt;150 breakpoints.</w:t>
+        <w:t xml:space="preserve">Sixty-seven distinct assemblies (the 122 FDA-ARGOS accessions include 54</w:t>
+      </w:r>
+      <w:r>
+        <w:t xml:space="preserve"> </w:t>
+      </w:r>
+      <w:r>
+        <w:t xml:space="preserve">GenBank/RefSeq or superseded-version twins of one another, which were</w:t>
+      </w:r>
+      <w:r>
+        <w:t xml:space="preserve"> </w:t>
+      </w:r>
+      <w:r>
+        <w:t xml:space="preserve">deduplicated), 2,211 non-self pairs, ANI 93.6–100%, re-run with Syn2bANI</w:t>
+      </w:r>
+      <w:r>
+        <w:t xml:space="preserve"> </w:t>
+      </w:r>
+      <w:r>
+        <w:t xml:space="preserve">v0.1.1. (a) ANI vs</w:t>
+      </w:r>
+      <w:r>
+        <w:t xml:space="preserve"> </w:t>
+      </w:r>
+      <w:r>
+        <w:rPr>
+          <w:rStyle w:val="VerbatimChar"/>
+        </w:rPr>
+        <w:t xml:space="preserve">breakpoint_count</w:t>
+      </w:r>
+      <w:r>
+        <w:t xml:space="preserve"> </w:t>
+      </w:r>
+      <w:r>
+        <w:t xml:space="preserve">by country of isolation (grey =</w:t>
+      </w:r>
+      <w:r>
+        <w:t xml:space="preserve"> </w:t>
+      </w:r>
+      <w:r>
+        <w:t xml:space="preserve">different countries; 351 pairs have no country on either side). (b)</w:t>
+      </w:r>
+      <w:r>
+        <w:t xml:space="preserve"> </w:t>
+      </w:r>
+      <w:r>
+        <w:t xml:space="preserve">Breakpoint-count distribution: 60.5% of pairs carry no breakpoints and the</w:t>
+      </w:r>
+      <w:r>
+        <w:t xml:space="preserve"> </w:t>
+      </w:r>
+      <w:r>
+        <w:t xml:space="preserve">maximum is 7. This collection is the negative control for the ANI–structure</w:t>
+      </w:r>
+      <w:r>
+        <w:t xml:space="preserve"> </w:t>
+      </w:r>
+      <w:r>
+        <w:t xml:space="preserve">decoupling: here the two are not decoupled.</w:t>
       </w:r>
     </w:p>
     <w:bookmarkEnd w:id="18"/>
@@ -1314,7 +1406,176 @@
       </w:r>
     </w:p>
     <w:bookmarkEnd w:id="22"/>
-    <w:bookmarkStart w:id="23" w:name="Xb79c9bf020a903d02af45c43b651fa33d5c8e03"/>
+    <w:bookmarkStart w:id="23" w:name="Xe1c79b05191abc8a66b5d1ddd0c21d804443fa3"/>
+    <w:p>
+      <w:pPr>
+        <w:pStyle w:val="Heading2"/>
+      </w:pPr>
+      <w:r>
+        <w:t xml:space="preserve">Supplementary Figure S15 — FDA-ARGOS</w:t>
+      </w:r>
+      <w:r>
+        <w:t xml:space="preserve"> </w:t>
+      </w:r>
+      <w:r>
+        <w:rPr>
+          <w:i/>
+          <w:iCs/>
+        </w:rPr>
+        <w:t xml:space="preserve">E. coli</w:t>
+      </w:r>
+      <w:r>
+        <w:t xml:space="preserve"> </w:t>
+      </w:r>
+      <w:r>
+        <w:t xml:space="preserve">structural and AMR discordance</w:t>
+      </w:r>
+    </w:p>
+    <w:p>
+      <w:pPr>
+        <w:pStyle w:val="FirstParagraph"/>
+      </w:pPr>
+      <w:r>
+        <w:t xml:space="preserve">(</w:t>
+      </w:r>
+      <w:r>
+        <w:rPr>
+          <w:rStyle w:val="VerbatimChar"/>
+        </w:rPr>
+        <w:t xml:space="preserve">paper/figures/supplementary/fig_s15_fda_argos_ecoli.png</w:t>
+      </w:r>
+      <w:r>
+        <w:t xml:space="preserve">)</w:t>
+      </w:r>
+    </w:p>
+    <w:p>
+      <w:pPr>
+        <w:pStyle w:val="BodyText"/>
+      </w:pPr>
+      <w:r>
+        <w:t xml:space="preserve">One hundred and twenty-nine FDA-ARGOS</w:t>
+      </w:r>
+      <w:r>
+        <w:t xml:space="preserve"> </w:t>
+      </w:r>
+      <w:r>
+        <w:rPr>
+          <w:i/>
+          <w:iCs/>
+        </w:rPr>
+        <w:t xml:space="preserve">E. coli</w:t>
+      </w:r>
+      <w:r>
+        <w:t xml:space="preserve"> </w:t>
+      </w:r>
+      <w:r>
+        <w:t xml:space="preserve">assemblies; 103 pairs at</w:t>
+      </w:r>
+      <w:r>
+        <w:t xml:space="preserve"> </w:t>
+      </w:r>
+      <w:r>
+        <w:t xml:space="preserve">skani ANI ≥ 99.9. (a) ANI distribution. (b) Structural classes from minimap2</w:t>
+      </w:r>
+      <w:r>
+        <w:t xml:space="preserve"> </w:t>
+      </w:r>
+      <w:r>
+        <w:t xml:space="preserve">validation: global flip/rotation convention artifacts (41 pairs), partial</w:t>
+      </w:r>
+      <w:r>
+        <w:t xml:space="preserve"> </w:t>
+      </w:r>
+      <w:r>
+        <w:t xml:space="preserve">inversions confirmed by minus-strand blocks (16 pairs), and collinear/local</w:t>
+      </w:r>
+      <w:r>
+        <w:t xml:space="preserve"> </w:t>
+      </w:r>
+      <w:r>
+        <w:t xml:space="preserve">events (46 pairs). (c) Core AMR-genotype discordance from NCBI Pathogen</w:t>
+      </w:r>
+      <w:r>
+        <w:t xml:space="preserve"> </w:t>
+      </w:r>
+      <w:r>
+        <w:t xml:space="preserve">Detection AMRFinderPlus calls: 60/103 pairs (58.3%) differ, including 11/24 at</w:t>
+      </w:r>
+      <w:r>
+        <w:t xml:space="preserve"> </w:t>
+      </w:r>
+      <w:r>
+        <w:t xml:space="preserve">ANI ≥ 99.99 and 3/10 at ANI ≥ 99.999. (d) Chromosome alignment blocks of at</w:t>
+      </w:r>
+      <w:r>
+        <w:t xml:space="preserve"> </w:t>
+      </w:r>
+      <w:r>
+        <w:t xml:space="preserve">least 100 kb for the ANI = 100.0 pair FDAARGOS_348/772, which differs by</w:t>
+      </w:r>
+      <w:r>
+        <w:t xml:space="preserve"> </w:t>
+      </w:r>
+      <w:r>
+        <w:t xml:space="preserve">tet(A)/tet(K) and a 48-kb insertion. These very-high-ANI reference-genome pairs</w:t>
+      </w:r>
+      <w:r>
+        <w:t xml:space="preserve"> </w:t>
+      </w:r>
+      <w:r>
+        <w:t xml:space="preserve">are not interpreted as inferred outbreak or transmission clusters. Source data:</w:t>
+      </w:r>
+      <w:r>
+        <w:t xml:space="preserve"> </w:t>
+      </w:r>
+      <w:r>
+        <w:rPr>
+          <w:rStyle w:val="VerbatimChar"/>
+        </w:rPr>
+        <w:t xml:space="preserve">case_studies/fda_argos/ANALYSIS.md</w:t>
+      </w:r>
+      <w:r>
+        <w:t xml:space="preserve">,</w:t>
+      </w:r>
+      <w:r>
+        <w:t xml:space="preserve"> </w:t>
+      </w:r>
+      <w:r>
+        <w:rPr>
+          <w:rStyle w:val="VerbatimChar"/>
+        </w:rPr>
+        <w:t xml:space="preserve">case_studies/fda_argos/validate/VALIDATION.md</w:t>
+      </w:r>
+      <w:r>
+        <w:t xml:space="preserve">,</w:t>
+      </w:r>
+      <w:r>
+        <w:t xml:space="preserve"> </w:t>
+      </w:r>
+      <w:r>
+        <w:rPr>
+          <w:rStyle w:val="VerbatimChar"/>
+        </w:rPr>
+        <w:t xml:space="preserve">case_studies/fda_argos/amr_discordance.tsv</w:t>
+      </w:r>
+      <w:r>
+        <w:t xml:space="preserve">, and</w:t>
+      </w:r>
+      <w:r>
+        <w:t xml:space="preserve"> </w:t>
+      </w:r>
+      <w:r>
+        <w:rPr>
+          <w:rStyle w:val="VerbatimChar"/>
+        </w:rPr>
+        <w:t xml:space="preserve">paper/supplementary/tables/Table_S7_FDA_ARGOS_AMR_structural.tsv</w:t>
+      </w:r>
+      <w:r>
+        <w:t xml:space="preserve">.</w:t>
+      </w:r>
+    </w:p>
+    <w:bookmarkEnd w:id="23"/>
+    <w:bookmarkStart w:id="24" w:name="Xb79c9bf020a903d02af45c43b651fa33d5c8e03"/>
     <w:p>
       <w:pPr>
         <w:pStyle w:val="Heading2"/>
@@ -1640,8 +1901,8 @@
         </w:tc>
       </w:tr>
     </w:tbl>
-    <w:bookmarkEnd w:id="23"/>
-    <w:bookmarkStart w:id="24" w:name="X1d1a5b89358b225a547ea735bc71b43678427f8"/>
+    <w:bookmarkEnd w:id="24"/>
+    <w:bookmarkStart w:id="25" w:name="X1d1a5b89358b225a547ea735bc71b43678427f8"/>
     <w:p>
       <w:pPr>
         <w:pStyle w:val="Heading2"/>
@@ -1955,8 +2216,8 @@
         </w:tc>
       </w:tr>
     </w:tbl>
-    <w:bookmarkEnd w:id="24"/>
-    <w:bookmarkStart w:id="25" w:name="X791b5905c3cbd3b80da6a27b4633a9dc2eda705"/>
+    <w:bookmarkEnd w:id="25"/>
+    <w:bookmarkStart w:id="26" w:name="X791b5905c3cbd3b80da6a27b4633a9dc2eda705"/>
     <w:p>
       <w:pPr>
         <w:pStyle w:val="Heading2"/>
@@ -2165,8 +2426,8 @@
         </w:tc>
       </w:tr>
     </w:tbl>
-    <w:bookmarkEnd w:id="25"/>
-    <w:bookmarkStart w:id="26" w:name="X71ce6833d789d49d6251da69c06300f4d632d80"/>
+    <w:bookmarkEnd w:id="26"/>
+    <w:bookmarkStart w:id="27" w:name="X71ce6833d789d49d6251da69c06300f4d632d80"/>
     <w:p>
       <w:pPr>
         <w:pStyle w:val="Heading2"/>
@@ -3012,6 +3273,539 @@
         <w:pStyle w:val="BodyText"/>
       </w:pPr>
       <w:r>
+        <w:t xml:space="preserve">The 432 complete-marker genomes were further partitioned by locality relative</w:t>
+      </w:r>
+      <w:r>
+        <w:t xml:space="preserve"> </w:t>
+      </w:r>
+      <w:r>
+        <w:t xml:space="preserve">to the cagPAI window:</w:t>
+      </w:r>
+      <w:r>
+        <w:t xml:space="preserve"> </w:t>
+      </w:r>
+      <w:r>
+        <w:rPr>
+          <w:rStyle w:val="VerbatimChar"/>
+        </w:rPr>
+        <w:t xml:space="preserve">complete_collinear</w:t>
+      </w:r>
+      <w:r>
+        <w:t xml:space="preserve"> </w:t>
+      </w:r>
+      <w:r>
+        <w:t xml:space="preserve">(n = 145),</w:t>
+      </w:r>
+      <w:r>
+        <w:t xml:space="preserve"> </w:t>
+      </w:r>
+      <w:r>
+        <w:rPr>
+          <w:rStyle w:val="VerbatimChar"/>
+        </w:rPr>
+        <w:t xml:space="preserve">island_internal</w:t>
+      </w:r>
+      <w:r>
+        <w:t xml:space="preserve"> </w:t>
+      </w:r>
+      <w:r>
+        <w:t xml:space="preserve">(n = 53),</w:t>
+      </w:r>
+      <w:r>
+        <w:t xml:space="preserve"> </w:t>
+      </w:r>
+      <w:r>
+        <w:rPr>
+          <w:rStyle w:val="VerbatimChar"/>
+        </w:rPr>
+        <w:t xml:space="preserve">island_boundary</w:t>
+      </w:r>
+      <w:r>
+        <w:t xml:space="preserve"> </w:t>
+      </w:r>
+      <w:r>
+        <w:t xml:space="preserve">(n = 101) and</w:t>
+      </w:r>
+      <w:r>
+        <w:t xml:space="preserve"> </w:t>
+      </w:r>
+      <w:r>
+        <w:rPr>
+          <w:rStyle w:val="VerbatimChar"/>
+        </w:rPr>
+        <w:t xml:space="preserve">island_spanned</w:t>
+      </w:r>
+      <w:r>
+        <w:t xml:space="preserve"> </w:t>
+      </w:r>
+      <w:r>
+        <w:t xml:space="preserve">(n = 133). For the binary</w:t>
+      </w:r>
+      <w:r>
+        <w:t xml:space="preserve"> </w:t>
+      </w:r>
+      <w:r>
+        <w:t xml:space="preserve">contrast,</w:t>
+      </w:r>
+      <w:r>
+        <w:t xml:space="preserve"> </w:t>
+      </w:r>
+      <w:r>
+        <w:rPr>
+          <w:rStyle w:val="VerbatimChar"/>
+        </w:rPr>
+        <w:t xml:space="preserve">island_internal</w:t>
+      </w:r>
+      <w:r>
+        <w:t xml:space="preserve"> </w:t>
+      </w:r>
+      <w:r>
+        <w:t xml:space="preserve">and</w:t>
+      </w:r>
+      <w:r>
+        <w:t xml:space="preserve"> </w:t>
+      </w:r>
+      <w:r>
+        <w:rPr>
+          <w:rStyle w:val="VerbatimChar"/>
+        </w:rPr>
+        <w:t xml:space="preserve">island_boundary</w:t>
+      </w:r>
+      <w:r>
+        <w:t xml:space="preserve"> </w:t>
+      </w:r>
+      <w:r>
+        <w:t xml:space="preserve">were combined as</w:t>
+      </w:r>
+      <w:r>
+        <w:t xml:space="preserve"> </w:t>
+      </w:r>
+      <w:r>
+        <w:t xml:space="preserve">island-altering calls, whereas</w:t>
+      </w:r>
+      <w:r>
+        <w:t xml:space="preserve"> </w:t>
+      </w:r>
+      <w:r>
+        <w:rPr>
+          <w:rStyle w:val="VerbatimChar"/>
+        </w:rPr>
+        <w:t xml:space="preserve">island_spanned</w:t>
+      </w:r>
+      <w:r>
+        <w:t xml:space="preserve"> </w:t>
+      </w:r>
+      <w:r>
+        <w:t xml:space="preserve">and</w:t>
+      </w:r>
+      <w:r>
+        <w:t xml:space="preserve"> </w:t>
+      </w:r>
+      <w:r>
+        <w:rPr>
+          <w:rStyle w:val="VerbatimChar"/>
+        </w:rPr>
+        <w:t xml:space="preserve">complete_collinear</w:t>
+      </w:r>
+      <w:r>
+        <w:t xml:space="preserve"> </w:t>
+      </w:r>
+      <w:r>
+        <w:t xml:space="preserve">were</w:t>
+      </w:r>
+      <w:r>
+        <w:t xml:space="preserve"> </w:t>
+      </w:r>
+      <w:r>
+        <w:t xml:space="preserve">combined as no island-altering call. The table reports the global Pearson</w:t>
+      </w:r>
+      <w:r>
+        <w:t xml:space="preserve"> </w:t>
+      </w:r>
+      <w:r>
+        <w:t xml:space="preserve">χ² test and the two post hoc binary contrasts; q values are</w:t>
+      </w:r>
+      <w:r>
+        <w:t xml:space="preserve"> </w:t>
+      </w:r>
+      <w:r>
+        <w:t xml:space="preserve">Benjamini–Hochberg FDR across these three locality tests.</w:t>
+      </w:r>
+    </w:p>
+    <w:tbl>
+      <w:tblPr>
+        <w:tblStyle w:val="Table"/>
+        <w:tblW w:type="pct" w:w="5000"/>
+        <w:tblLayout w:type="fixed"/>
+        <w:tblLook w:firstRow="1" w:lastRow="0" w:firstColumn="0" w:lastColumn="0" w:noHBand="0" w:noVBand="0" w:val="0020"/>
+      </w:tblPr>
+      <w:tblGrid>
+        <w:gridCol w:w="1080"/>
+        <w:gridCol w:w="1440"/>
+        <w:gridCol w:w="1440"/>
+        <w:gridCol w:w="1080"/>
+        <w:gridCol w:w="1440"/>
+        <w:gridCol w:w="1440"/>
+      </w:tblGrid>
+      <w:tr>
+        <w:trPr>
+          <w:tblHeader w:val="on"/>
+        </w:trPr>
+        <w:tc>
+          <w:tcPr/>
+          <w:p>
+            <w:pPr>
+              <w:pStyle w:val="Compact"/>
+            </w:pPr>
+            <w:r>
+              <w:t xml:space="preserve">Locality test</w:t>
+            </w:r>
+          </w:p>
+        </w:tc>
+        <w:tc>
+          <w:tcPr/>
+          <w:p>
+            <w:pPr>
+              <w:pStyle w:val="Compact"/>
+              <w:jc w:val="right"/>
+            </w:pPr>
+            <w:r>
+              <w:t xml:space="preserve">n</w:t>
+            </w:r>
+          </w:p>
+        </w:tc>
+        <w:tc>
+          <w:tcPr/>
+          <w:p>
+            <w:pPr>
+              <w:pStyle w:val="Compact"/>
+              <w:jc w:val="right"/>
+            </w:pPr>
+            <w:r>
+              <w:t xml:space="preserve">Effect</w:t>
+            </w:r>
+          </w:p>
+        </w:tc>
+        <w:tc>
+          <w:tcPr/>
+          <w:p>
+            <w:pPr>
+              <w:pStyle w:val="Compact"/>
+            </w:pPr>
+            <w:r>
+              <w:t xml:space="preserve">95% CI</w:t>
+            </w:r>
+          </w:p>
+        </w:tc>
+        <w:tc>
+          <w:tcPr/>
+          <w:p>
+            <w:pPr>
+              <w:pStyle w:val="Compact"/>
+              <w:jc w:val="right"/>
+            </w:pPr>
+            <w:r>
+              <w:t xml:space="preserve">p</w:t>
+            </w:r>
+          </w:p>
+        </w:tc>
+        <w:tc>
+          <w:tcPr/>
+          <w:p>
+            <w:pPr>
+              <w:pStyle w:val="Compact"/>
+              <w:jc w:val="right"/>
+            </w:pPr>
+            <w:r>
+              <w:t xml:space="preserve">q</w:t>
+            </w:r>
+          </w:p>
+        </w:tc>
+      </w:tr>
+      <w:tr>
+        <w:tc>
+          <w:tcPr/>
+          <w:p>
+            <w:pPr>
+              <w:pStyle w:val="Compact"/>
+            </w:pPr>
+            <w:r>
+              <w:t xml:space="preserve">Four-stage × four-level locality</w:t>
+            </w:r>
+          </w:p>
+        </w:tc>
+        <w:tc>
+          <w:tcPr/>
+          <w:p>
+            <w:pPr>
+              <w:pStyle w:val="Compact"/>
+              <w:jc w:val="right"/>
+            </w:pPr>
+            <w:r>
+              <w:t xml:space="preserve">432</w:t>
+            </w:r>
+          </w:p>
+        </w:tc>
+        <w:tc>
+          <w:tcPr/>
+          <w:p>
+            <w:pPr>
+              <w:pStyle w:val="Compact"/>
+              <w:jc w:val="right"/>
+            </w:pPr>
+            <w:r>
+              <w:t xml:space="preserve">χ² = 19.75 (df = 9)</w:t>
+            </w:r>
+          </w:p>
+        </w:tc>
+        <w:tc>
+          <w:tcPr/>
+          <w:p>
+            <w:pPr>
+              <w:pStyle w:val="Compact"/>
+            </w:pPr>
+            <w:r>
+              <w:t xml:space="preserve">—</w:t>
+            </w:r>
+          </w:p>
+        </w:tc>
+        <w:tc>
+          <w:tcPr/>
+          <w:p>
+            <w:pPr>
+              <w:pStyle w:val="Compact"/>
+              <w:jc w:val="right"/>
+            </w:pPr>
+            <w:r>
+              <w:t xml:space="preserve">0.0195</w:t>
+            </w:r>
+          </w:p>
+        </w:tc>
+        <w:tc>
+          <w:tcPr/>
+          <w:p>
+            <w:pPr>
+              <w:pStyle w:val="Compact"/>
+              <w:jc w:val="right"/>
+            </w:pPr>
+            <w:r>
+              <w:t xml:space="preserve">0.0302</w:t>
+            </w:r>
+          </w:p>
+        </w:tc>
+      </w:tr>
+      <w:tr>
+        <w:tc>
+          <w:tcPr/>
+          <w:p>
+            <w:pPr>
+              <w:pStyle w:val="Compact"/>
+            </w:pPr>
+            <w:r>
+              <w:t xml:space="preserve">Island-altering locality, GC vs NAG</w:t>
+            </w:r>
+          </w:p>
+        </w:tc>
+        <w:tc>
+          <w:tcPr/>
+          <w:p>
+            <w:pPr>
+              <w:pStyle w:val="Compact"/>
+              <w:jc w:val="right"/>
+            </w:pPr>
+            <w:r>
+              <w:t xml:space="preserve">230</w:t>
+            </w:r>
+          </w:p>
+        </w:tc>
+        <w:tc>
+          <w:tcPr/>
+          <w:p>
+            <w:pPr>
+              <w:pStyle w:val="Compact"/>
+              <w:jc w:val="right"/>
+            </w:pPr>
+            <w:r>
+              <w:t xml:space="preserve">crude OR = 1.18</w:t>
+            </w:r>
+          </w:p>
+        </w:tc>
+        <w:tc>
+          <w:tcPr/>
+          <w:p>
+            <w:pPr>
+              <w:pStyle w:val="Compact"/>
+            </w:pPr>
+            <w:r>
+              <w:t xml:space="preserve">0.69–2.04</w:t>
+            </w:r>
+          </w:p>
+        </w:tc>
+        <w:tc>
+          <w:tcPr/>
+          <w:p>
+            <w:pPr>
+              <w:pStyle w:val="Compact"/>
+              <w:jc w:val="right"/>
+            </w:pPr>
+            <w:r>
+              <w:t xml:space="preserve">0.579</w:t>
+            </w:r>
+          </w:p>
+        </w:tc>
+        <w:tc>
+          <w:tcPr/>
+          <w:p>
+            <w:pPr>
+              <w:pStyle w:val="Compact"/>
+              <w:jc w:val="right"/>
+            </w:pPr>
+            <w:r>
+              <w:t xml:space="preserve">0.579</w:t>
+            </w:r>
+          </w:p>
+        </w:tc>
+      </w:tr>
+      <w:tr>
+        <w:tc>
+          <w:tcPr/>
+          <w:p>
+            <w:pPr>
+              <w:pStyle w:val="Compact"/>
+            </w:pPr>
+            <w:r>
+              <w:t xml:space="preserve">Island-altering locality, advanced vs early</w:t>
+            </w:r>
+          </w:p>
+        </w:tc>
+        <w:tc>
+          <w:tcPr/>
+          <w:p>
+            <w:pPr>
+              <w:pStyle w:val="Compact"/>
+              <w:jc w:val="right"/>
+            </w:pPr>
+            <w:r>
+              <w:t xml:space="preserve">432</w:t>
+            </w:r>
+          </w:p>
+        </w:tc>
+        <w:tc>
+          <w:tcPr/>
+          <w:p>
+            <w:pPr>
+              <w:pStyle w:val="Compact"/>
+              <w:jc w:val="right"/>
+            </w:pPr>
+            <w:r>
+              <w:t xml:space="preserve">crude OR = 1.61</w:t>
+            </w:r>
+          </w:p>
+        </w:tc>
+        <w:tc>
+          <w:tcPr/>
+          <w:p>
+            <w:pPr>
+              <w:pStyle w:val="Compact"/>
+            </w:pPr>
+            <w:r>
+              <w:t xml:space="preserve">1.08–2.39</w:t>
+            </w:r>
+          </w:p>
+        </w:tc>
+        <w:tc>
+          <w:tcPr/>
+          <w:p>
+            <w:pPr>
+              <w:pStyle w:val="Compact"/>
+              <w:jc w:val="right"/>
+            </w:pPr>
+            <w:r>
+              <w:t xml:space="preserve">0.0201</w:t>
+            </w:r>
+          </w:p>
+        </w:tc>
+        <w:tc>
+          <w:tcPr/>
+          <w:p>
+            <w:pPr>
+              <w:pStyle w:val="Compact"/>
+              <w:jc w:val="right"/>
+            </w:pPr>
+            <w:r>
+              <w:t xml:space="preserve">0.0302</w:t>
+            </w:r>
+          </w:p>
+        </w:tc>
+      </w:tr>
+    </w:tbl>
+    <w:p>
+      <w:pPr>
+        <w:pStyle w:val="BodyText"/>
+      </w:pPr>
+      <w:r>
+        <w:t xml:space="preserve">FastBAPS lineage attenuated the advanced-versus-early locality contrast:</w:t>
+      </w:r>
+      <w:r>
+        <w:t xml:space="preserve"> </w:t>
+      </w:r>
+      <w:r>
+        <w:t xml:space="preserve">the CMH Mantel–Haenszel OR was 1.36 (95% CI 0.90–2.06, CMH p = 0.14;</w:t>
+      </w:r>
+      <w:r>
+        <w:t xml:space="preserve"> </w:t>
+      </w:r>
+      <w:r>
+        <w:t xml:space="preserve">Breslow–Day p = 0.064). The GC-versus-NAG locality contrast was null before</w:t>
+      </w:r>
+      <w:r>
+        <w:t xml:space="preserve"> </w:t>
+      </w:r>
+      <w:r>
+        <w:t xml:space="preserve">and after stratification (CMH OR = 1.42, 95% CI 0.78–2.58, CMH p = 0.25).</w:t>
+      </w:r>
+      <w:r>
+        <w:t xml:space="preserve"> </w:t>
+      </w:r>
+      <w:r>
+        <w:t xml:space="preserve">Thus locality adds a biologically interpretable partition of rearrangement</w:t>
+      </w:r>
+      <w:r>
+        <w:t xml:space="preserve"> </w:t>
+      </w:r>
+      <w:r>
+        <w:t xml:space="preserve">calls, but it does not establish an independent disease association after</w:t>
+      </w:r>
+      <w:r>
+        <w:t xml:space="preserve"> </w:t>
+      </w:r>
+      <w:r>
+        <w:t xml:space="preserve">lineage stratification. Per-stratum counts and the full four-stage locality</w:t>
+      </w:r>
+      <w:r>
+        <w:t xml:space="preserve"> </w:t>
+      </w:r>
+      <w:r>
+        <w:t xml:space="preserve">table are in</w:t>
+      </w:r>
+      <w:r>
+        <w:t xml:space="preserve"> </w:t>
+      </w:r>
+      <w:r>
+        <w:rPr>
+          <w:rStyle w:val="VerbatimChar"/>
+        </w:rPr>
+        <w:t xml:space="preserve">case_studies/h_pylori_cagpai/results/cagpai_locality_disease_association.tsv</w:t>
+      </w:r>
+      <w:r>
+        <w:t xml:space="preserve">.</w:t>
+      </w:r>
+    </w:p>
+    <w:p>
+      <w:pPr>
+        <w:pStyle w:val="BodyText"/>
+      </w:pPr>
+      <w:r>
         <w:t xml:space="preserve">Rearrangement-state associations were also evaluated across artifact-span</w:t>
       </w:r>
       <w:r>
@@ -3054,8 +3848,8 @@
         <w:t xml:space="preserve">.</w:t>
       </w:r>
     </w:p>
-    <w:bookmarkEnd w:id="26"/>
-    <w:bookmarkStart w:id="27" w:name="X0ddedd77d100d0b74814f89ea378e8d5927a82e"/>
+    <w:bookmarkEnd w:id="27"/>
+    <w:bookmarkStart w:id="28" w:name="X0ddedd77d100d0b74814f89ea378e8d5927a82e"/>
     <w:p>
       <w:pPr>
         <w:pStyle w:val="Heading2"/>
@@ -4028,8 +4822,8 @@
         <w:t xml:space="preserve">.</w:t>
       </w:r>
     </w:p>
-    <w:bookmarkEnd w:id="27"/>
-    <w:bookmarkStart w:id="28" w:name="X2ff3ab002bfcdc4c8ad1f9a43f54a269f3dbba3"/>
+    <w:bookmarkEnd w:id="28"/>
+    <w:bookmarkStart w:id="29" w:name="X2ff3ab002bfcdc4c8ad1f9a43f54a269f3dbba3"/>
     <w:p>
       <w:pPr>
         <w:pStyle w:val="Heading2"/>
@@ -4801,13 +5595,825 @@
         <w:t xml:space="preserve">which the screen was exercised is the n = 5,000 all-vs-all above.</w:t>
       </w:r>
     </w:p>
-    <w:bookmarkEnd w:id="28"/>
-    <w:bookmarkStart w:id="29" w:name="Xe280e63292e65e7cc12ffc5dad24d6a06d19d0f"/>
+    <w:bookmarkEnd w:id="29"/>
+    <w:bookmarkStart w:id="30" w:name="Xa38a9c56b46811c2cfa1237f15091cacd9fe86a"/>
     <w:p>
       <w:pPr>
         <w:pStyle w:val="Heading2"/>
       </w:pPr>
       <w:r>
+        <w:t xml:space="preserve">Supplementary Table S7 — FDA-ARGOS</w:t>
+      </w:r>
+      <w:r>
+        <w:t xml:space="preserve"> </w:t>
+      </w:r>
+      <w:r>
+        <w:rPr>
+          <w:i/>
+          <w:iCs/>
+        </w:rPr>
+        <w:t xml:space="preserve">E. coli</w:t>
+      </w:r>
+      <w:r>
+        <w:t xml:space="preserve"> </w:t>
+      </w:r>
+      <w:r>
+        <w:t xml:space="preserve">structural validation and AMR-genotype discordance</w:t>
+      </w:r>
+    </w:p>
+    <w:p>
+      <w:pPr>
+        <w:pStyle w:val="FirstParagraph"/>
+      </w:pPr>
+      <w:r>
+        <w:t xml:space="preserve">One hundred and twenty-nine FDA-ARGOS assemblies yielded 103 skani pairs at</w:t>
+      </w:r>
+      <w:r>
+        <w:t xml:space="preserve"> </w:t>
+      </w:r>
+      <w:r>
+        <w:t xml:space="preserve">ANI ≥ 99.9. AMR genotypes were derived from NCBI Pathogen Detection</w:t>
+      </w:r>
+      <w:r>
+        <w:t xml:space="preserve"> </w:t>
+      </w:r>
+      <w:r>
+        <w:t xml:space="preserve">AMRFinderPlus core calls; prevalent/intrinsic genes (≥50% prevalence) were</w:t>
+      </w:r>
+      <w:r>
+        <w:t xml:space="preserve"> </w:t>
+      </w:r>
+      <w:r>
+        <w:t xml:space="preserve">removed before acquired-gene analysis, although no gene met that prevalence</w:t>
+      </w:r>
+      <w:r>
+        <w:t xml:space="preserve"> </w:t>
+      </w:r>
+      <w:r>
+        <w:t xml:space="preserve">threshold in this collection. Structural calls were classified after minimap2</w:t>
+      </w:r>
+      <w:r>
+        <w:t xml:space="preserve"> </w:t>
+      </w:r>
+      <w:r>
+        <w:t xml:space="preserve">validation and orientation/rotation-artifact review. Pair-level and event-level</w:t>
+      </w:r>
+      <w:r>
+        <w:t xml:space="preserve"> </w:t>
+      </w:r>
+      <w:r>
+        <w:t xml:space="preserve">source data are in</w:t>
+      </w:r>
+      <w:r>
+        <w:t xml:space="preserve"> </w:t>
+      </w:r>
+      <w:r>
+        <w:rPr>
+          <w:rStyle w:val="VerbatimChar"/>
+        </w:rPr>
+        <w:t xml:space="preserve">case_studies/fda_argos/amr_discordance.tsv</w:t>
+      </w:r>
+      <w:r>
+        <w:t xml:space="preserve"> </w:t>
+      </w:r>
+      <w:r>
+        <w:t xml:space="preserve">and</w:t>
+      </w:r>
+      <w:r>
+        <w:t xml:space="preserve"> </w:t>
+      </w:r>
+      <w:r>
+        <w:rPr>
+          <w:rStyle w:val="VerbatimChar"/>
+        </w:rPr>
+        <w:t xml:space="preserve">case_studies/fda_argos/validate/VALIDATION.md</w:t>
+      </w:r>
+      <w:r>
+        <w:t xml:space="preserve">; the machine-readable summary is</w:t>
+      </w:r>
+      <w:r>
+        <w:t xml:space="preserve"> </w:t>
+      </w:r>
+      <w:r>
+        <w:rPr>
+          <w:rStyle w:val="VerbatimChar"/>
+        </w:rPr>
+        <w:t xml:space="preserve">paper/supplementary/tables/Table_S7_FDA_ARGOS_AMR_structural.tsv</w:t>
+      </w:r>
+      <w:r>
+        <w:t xml:space="preserve">.</w:t>
+      </w:r>
+    </w:p>
+    <w:tbl>
+      <w:tblPr>
+        <w:tblStyle w:val="Table"/>
+        <w:tblW w:type="pct" w:w="5000"/>
+        <w:tblLayout w:type="fixed"/>
+        <w:tblLook w:firstRow="1" w:lastRow="0" w:firstColumn="0" w:lastColumn="0" w:noHBand="0" w:noVBand="0" w:val="0020"/>
+      </w:tblPr>
+      <w:tblGrid>
+        <w:gridCol w:w="1697"/>
+        <w:gridCol w:w="1697"/>
+        <w:gridCol w:w="2262"/>
+        <w:gridCol w:w="2262"/>
+      </w:tblGrid>
+      <w:tr>
+        <w:trPr>
+          <w:tblHeader w:val="on"/>
+        </w:trPr>
+        <w:tc>
+          <w:tcPr/>
+          <w:p>
+            <w:pPr>
+              <w:pStyle w:val="Compact"/>
+            </w:pPr>
+            <w:r>
+              <w:t xml:space="preserve">Category</w:t>
+            </w:r>
+          </w:p>
+        </w:tc>
+        <w:tc>
+          <w:tcPr/>
+          <w:p>
+            <w:pPr>
+              <w:pStyle w:val="Compact"/>
+            </w:pPr>
+            <w:r>
+              <w:t xml:space="preserve">Group</w:t>
+            </w:r>
+          </w:p>
+        </w:tc>
+        <w:tc>
+          <w:tcPr/>
+          <w:p>
+            <w:pPr>
+              <w:pStyle w:val="Compact"/>
+              <w:jc w:val="right"/>
+            </w:pPr>
+            <w:r>
+              <w:t xml:space="preserve">Count</w:t>
+            </w:r>
+          </w:p>
+        </w:tc>
+        <w:tc>
+          <w:tcPr/>
+          <w:p>
+            <w:pPr>
+              <w:pStyle w:val="Compact"/>
+              <w:jc w:val="right"/>
+            </w:pPr>
+            <w:r>
+              <w:t xml:space="preserve">Value</w:t>
+            </w:r>
+          </w:p>
+        </w:tc>
+      </w:tr>
+      <w:tr>
+        <w:tc>
+          <w:tcPr/>
+          <w:p>
+            <w:pPr>
+              <w:pStyle w:val="Compact"/>
+            </w:pPr>
+            <w:r>
+              <w:t xml:space="preserve">AMR discordance</w:t>
+            </w:r>
+          </w:p>
+        </w:tc>
+        <w:tc>
+          <w:tcPr/>
+          <w:p>
+            <w:pPr>
+              <w:pStyle w:val="Compact"/>
+            </w:pPr>
+            <w:r>
+              <w:t xml:space="preserve">ANI ≥ 99.9</w:t>
+            </w:r>
+          </w:p>
+        </w:tc>
+        <w:tc>
+          <w:tcPr/>
+          <w:p>
+            <w:pPr>
+              <w:pStyle w:val="Compact"/>
+              <w:jc w:val="right"/>
+            </w:pPr>
+            <w:r>
+              <w:t xml:space="preserve">60/103</w:t>
+            </w:r>
+          </w:p>
+        </w:tc>
+        <w:tc>
+          <w:tcPr/>
+          <w:p>
+            <w:pPr>
+              <w:pStyle w:val="Compact"/>
+              <w:jc w:val="right"/>
+            </w:pPr>
+            <w:r>
+              <w:t xml:space="preserve">58.3%</w:t>
+            </w:r>
+          </w:p>
+        </w:tc>
+      </w:tr>
+      <w:tr>
+        <w:tc>
+          <w:tcPr/>
+          <w:p>
+            <w:pPr>
+              <w:pStyle w:val="Compact"/>
+            </w:pPr>
+            <w:r>
+              <w:t xml:space="preserve">AMR discordance</w:t>
+            </w:r>
+          </w:p>
+        </w:tc>
+        <w:tc>
+          <w:tcPr/>
+          <w:p>
+            <w:pPr>
+              <w:pStyle w:val="Compact"/>
+            </w:pPr>
+            <w:r>
+              <w:t xml:space="preserve">ANI ≥ 99.99</w:t>
+            </w:r>
+          </w:p>
+        </w:tc>
+        <w:tc>
+          <w:tcPr/>
+          <w:p>
+            <w:pPr>
+              <w:pStyle w:val="Compact"/>
+              <w:jc w:val="right"/>
+            </w:pPr>
+            <w:r>
+              <w:t xml:space="preserve">11/24</w:t>
+            </w:r>
+          </w:p>
+        </w:tc>
+        <w:tc>
+          <w:tcPr/>
+          <w:p>
+            <w:pPr>
+              <w:pStyle w:val="Compact"/>
+              <w:jc w:val="right"/>
+            </w:pPr>
+            <w:r>
+              <w:t xml:space="preserve">45.8%</w:t>
+            </w:r>
+          </w:p>
+        </w:tc>
+      </w:tr>
+      <w:tr>
+        <w:tc>
+          <w:tcPr/>
+          <w:p>
+            <w:pPr>
+              <w:pStyle w:val="Compact"/>
+            </w:pPr>
+            <w:r>
+              <w:t xml:space="preserve">AMR discordance</w:t>
+            </w:r>
+          </w:p>
+        </w:tc>
+        <w:tc>
+          <w:tcPr/>
+          <w:p>
+            <w:pPr>
+              <w:pStyle w:val="Compact"/>
+            </w:pPr>
+            <w:r>
+              <w:t xml:space="preserve">ANI ≥ 99.999</w:t>
+            </w:r>
+          </w:p>
+        </w:tc>
+        <w:tc>
+          <w:tcPr/>
+          <w:p>
+            <w:pPr>
+              <w:pStyle w:val="Compact"/>
+              <w:jc w:val="right"/>
+            </w:pPr>
+            <w:r>
+              <w:t xml:space="preserve">3/10</w:t>
+            </w:r>
+          </w:p>
+        </w:tc>
+        <w:tc>
+          <w:tcPr/>
+          <w:p>
+            <w:pPr>
+              <w:pStyle w:val="Compact"/>
+              <w:jc w:val="right"/>
+            </w:pPr>
+            <w:r>
+              <w:t xml:space="preserve">30.0%</w:t>
+            </w:r>
+          </w:p>
+        </w:tc>
+      </w:tr>
+      <w:tr>
+        <w:tc>
+          <w:tcPr/>
+          <w:p>
+            <w:pPr>
+              <w:pStyle w:val="Compact"/>
+            </w:pPr>
+            <w:r>
+              <w:t xml:space="preserve">Structural pair class</w:t>
+            </w:r>
+          </w:p>
+        </w:tc>
+        <w:tc>
+          <w:tcPr/>
+          <w:p>
+            <w:pPr>
+              <w:pStyle w:val="Compact"/>
+            </w:pPr>
+            <w:r>
+              <w:t xml:space="preserve">global flip/rotation</w:t>
+            </w:r>
+          </w:p>
+        </w:tc>
+        <w:tc>
+          <w:tcPr/>
+          <w:p>
+            <w:pPr>
+              <w:pStyle w:val="Compact"/>
+              <w:jc w:val="right"/>
+            </w:pPr>
+            <w:r>
+              <w:t xml:space="preserve">41/103</w:t>
+            </w:r>
+          </w:p>
+        </w:tc>
+        <w:tc>
+          <w:tcPr/>
+          <w:p>
+            <w:pPr>
+              <w:pStyle w:val="Compact"/>
+              <w:jc w:val="right"/>
+            </w:pPr>
+            <w:r>
+              <w:t xml:space="preserve">39.8%</w:t>
+            </w:r>
+          </w:p>
+        </w:tc>
+      </w:tr>
+      <w:tr>
+        <w:tc>
+          <w:tcPr/>
+          <w:p>
+            <w:pPr>
+              <w:pStyle w:val="Compact"/>
+            </w:pPr>
+            <w:r>
+              <w:t xml:space="preserve">Structural pair class</w:t>
+            </w:r>
+          </w:p>
+        </w:tc>
+        <w:tc>
+          <w:tcPr/>
+          <w:p>
+            <w:pPr>
+              <w:pStyle w:val="Compact"/>
+            </w:pPr>
+            <w:r>
+              <w:t xml:space="preserve">partial inversion</w:t>
+            </w:r>
+          </w:p>
+        </w:tc>
+        <w:tc>
+          <w:tcPr/>
+          <w:p>
+            <w:pPr>
+              <w:pStyle w:val="Compact"/>
+              <w:jc w:val="right"/>
+            </w:pPr>
+            <w:r>
+              <w:t xml:space="preserve">16/103</w:t>
+            </w:r>
+          </w:p>
+        </w:tc>
+        <w:tc>
+          <w:tcPr/>
+          <w:p>
+            <w:pPr>
+              <w:pStyle w:val="Compact"/>
+              <w:jc w:val="right"/>
+            </w:pPr>
+            <w:r>
+              <w:t xml:space="preserve">15.5%</w:t>
+            </w:r>
+          </w:p>
+        </w:tc>
+      </w:tr>
+      <w:tr>
+        <w:tc>
+          <w:tcPr/>
+          <w:p>
+            <w:pPr>
+              <w:pStyle w:val="Compact"/>
+            </w:pPr>
+            <w:r>
+              <w:t xml:space="preserve">Structural pair class</w:t>
+            </w:r>
+          </w:p>
+        </w:tc>
+        <w:tc>
+          <w:tcPr/>
+          <w:p>
+            <w:pPr>
+              <w:pStyle w:val="Compact"/>
+            </w:pPr>
+            <w:r>
+              <w:t xml:space="preserve">collinear/local</w:t>
+            </w:r>
+          </w:p>
+        </w:tc>
+        <w:tc>
+          <w:tcPr/>
+          <w:p>
+            <w:pPr>
+              <w:pStyle w:val="Compact"/>
+              <w:jc w:val="right"/>
+            </w:pPr>
+            <w:r>
+              <w:t xml:space="preserve">46/103</w:t>
+            </w:r>
+          </w:p>
+        </w:tc>
+        <w:tc>
+          <w:tcPr/>
+          <w:p>
+            <w:pPr>
+              <w:pStyle w:val="Compact"/>
+              <w:jc w:val="right"/>
+            </w:pPr>
+            <w:r>
+              <w:t xml:space="preserve">44.7%</w:t>
+            </w:r>
+          </w:p>
+        </w:tc>
+      </w:tr>
+      <w:tr>
+        <w:tc>
+          <w:tcPr/>
+          <w:p>
+            <w:pPr>
+              <w:pStyle w:val="Compact"/>
+            </w:pPr>
+            <w:r>
+              <w:t xml:space="preserve">Pair-level genuine SV</w:t>
+            </w:r>
+          </w:p>
+        </w:tc>
+        <w:tc>
+          <w:tcPr/>
+          <w:p>
+            <w:pPr>
+              <w:pStyle w:val="Compact"/>
+            </w:pPr>
+            <w:r>
+              <w:t xml:space="preserve">ANI ≥ 99.9</w:t>
+            </w:r>
+          </w:p>
+        </w:tc>
+        <w:tc>
+          <w:tcPr/>
+          <w:p>
+            <w:pPr>
+              <w:pStyle w:val="Compact"/>
+              <w:jc w:val="right"/>
+            </w:pPr>
+            <w:r>
+              <w:t xml:space="preserve">101/103</w:t>
+            </w:r>
+          </w:p>
+        </w:tc>
+        <w:tc>
+          <w:tcPr/>
+          <w:p>
+            <w:pPr>
+              <w:pStyle w:val="Compact"/>
+              <w:jc w:val="right"/>
+            </w:pPr>
+            <w:r>
+              <w:t xml:space="preserve">98.1%</w:t>
+            </w:r>
+          </w:p>
+        </w:tc>
+      </w:tr>
+      <w:tr>
+        <w:tc>
+          <w:tcPr/>
+          <w:p>
+            <w:pPr>
+              <w:pStyle w:val="Compact"/>
+            </w:pPr>
+            <w:r>
+              <w:t xml:space="preserve">Event accounting</w:t>
+            </w:r>
+          </w:p>
+        </w:tc>
+        <w:tc>
+          <w:tcPr/>
+          <w:p>
+            <w:pPr>
+              <w:pStyle w:val="Compact"/>
+            </w:pPr>
+            <w:r>
+              <w:t xml:space="preserve">artifact INV/TRA</w:t>
+            </w:r>
+          </w:p>
+        </w:tc>
+        <w:tc>
+          <w:tcPr/>
+          <w:p>
+            <w:pPr>
+              <w:pStyle w:val="Compact"/>
+              <w:jc w:val="right"/>
+            </w:pPr>
+            <w:r>
+              <w:t xml:space="preserve">355/2,718</w:t>
+            </w:r>
+          </w:p>
+        </w:tc>
+        <w:tc>
+          <w:tcPr/>
+          <w:p>
+            <w:pPr>
+              <w:pStyle w:val="Compact"/>
+              <w:jc w:val="right"/>
+            </w:pPr>
+            <w:r>
+              <w:t xml:space="preserve">13.1%</w:t>
+            </w:r>
+          </w:p>
+        </w:tc>
+      </w:tr>
+      <w:tr>
+        <w:tc>
+          <w:tcPr/>
+          <w:p>
+            <w:pPr>
+              <w:pStyle w:val="Compact"/>
+            </w:pPr>
+            <w:r>
+              <w:t xml:space="preserve">Event accounting</w:t>
+            </w:r>
+          </w:p>
+        </w:tc>
+        <w:tc>
+          <w:tcPr/>
+          <w:p>
+            <w:pPr>
+              <w:pStyle w:val="Compact"/>
+            </w:pPr>
+            <w:r>
+              <w:t xml:space="preserve">artifact indel at rotation junction</w:t>
+            </w:r>
+          </w:p>
+        </w:tc>
+        <w:tc>
+          <w:tcPr/>
+          <w:p>
+            <w:pPr>
+              <w:pStyle w:val="Compact"/>
+              <w:jc w:val="right"/>
+            </w:pPr>
+            <w:r>
+              <w:t xml:space="preserve">3/2,718</w:t>
+            </w:r>
+          </w:p>
+        </w:tc>
+        <w:tc>
+          <w:tcPr/>
+          <w:p>
+            <w:pPr>
+              <w:pStyle w:val="Compact"/>
+              <w:jc w:val="right"/>
+            </w:pPr>
+            <w:r>
+              <w:t xml:space="preserve">0.1%</w:t>
+            </w:r>
+          </w:p>
+        </w:tc>
+      </w:tr>
+      <w:tr>
+        <w:tc>
+          <w:tcPr/>
+          <w:p>
+            <w:pPr>
+              <w:pStyle w:val="Compact"/>
+            </w:pPr>
+            <w:r>
+              <w:t xml:space="preserve">Event accounting</w:t>
+            </w:r>
+          </w:p>
+        </w:tc>
+        <w:tc>
+          <w:tcPr/>
+          <w:p>
+            <w:pPr>
+              <w:pStyle w:val="Compact"/>
+            </w:pPr>
+            <w:r>
+              <w:t xml:space="preserve">genuine chromosomal indel ≥1 kb</w:t>
+            </w:r>
+          </w:p>
+        </w:tc>
+        <w:tc>
+          <w:tcPr/>
+          <w:p>
+            <w:pPr>
+              <w:pStyle w:val="Compact"/>
+              <w:jc w:val="right"/>
+            </w:pPr>
+            <w:r>
+              <w:t xml:space="preserve">876/2,718</w:t>
+            </w:r>
+          </w:p>
+        </w:tc>
+        <w:tc>
+          <w:tcPr/>
+          <w:p>
+            <w:pPr>
+              <w:pStyle w:val="Compact"/>
+              <w:jc w:val="right"/>
+            </w:pPr>
+            <w:r>
+              <w:t xml:space="preserve">32.2%</w:t>
+            </w:r>
+          </w:p>
+        </w:tc>
+      </w:tr>
+      <w:tr>
+        <w:tc>
+          <w:tcPr/>
+          <w:p>
+            <w:pPr>
+              <w:pStyle w:val="Compact"/>
+            </w:pPr>
+            <w:r>
+              <w:t xml:space="preserve">Event accounting</w:t>
+            </w:r>
+          </w:p>
+        </w:tc>
+        <w:tc>
+          <w:tcPr/>
+          <w:p>
+            <w:pPr>
+              <w:pStyle w:val="Compact"/>
+            </w:pPr>
+            <w:r>
+              <w:t xml:space="preserve">genuine rearrangement</w:t>
+            </w:r>
+          </w:p>
+        </w:tc>
+        <w:tc>
+          <w:tcPr/>
+          <w:p>
+            <w:pPr>
+              <w:pStyle w:val="Compact"/>
+              <w:jc w:val="right"/>
+            </w:pPr>
+            <w:r>
+              <w:t xml:space="preserve">445/2,718</w:t>
+            </w:r>
+          </w:p>
+        </w:tc>
+        <w:tc>
+          <w:tcPr/>
+          <w:p>
+            <w:pPr>
+              <w:pStyle w:val="Compact"/>
+              <w:jc w:val="right"/>
+            </w:pPr>
+            <w:r>
+              <w:t xml:space="preserve">16.4%</w:t>
+            </w:r>
+          </w:p>
+        </w:tc>
+      </w:tr>
+      <w:tr>
+        <w:tc>
+          <w:tcPr/>
+          <w:p>
+            <w:pPr>
+              <w:pStyle w:val="Compact"/>
+            </w:pPr>
+            <w:r>
+              <w:t xml:space="preserve">Event accounting</w:t>
+            </w:r>
+          </w:p>
+        </w:tc>
+        <w:tc>
+          <w:tcPr/>
+          <w:p>
+            <w:pPr>
+              <w:pStyle w:val="Compact"/>
+            </w:pPr>
+            <w:r>
+              <w:t xml:space="preserve">genuine off-chromosome difference</w:t>
+            </w:r>
+          </w:p>
+        </w:tc>
+        <w:tc>
+          <w:tcPr/>
+          <w:p>
+            <w:pPr>
+              <w:pStyle w:val="Compact"/>
+              <w:jc w:val="right"/>
+            </w:pPr>
+            <w:r>
+              <w:t xml:space="preserve">880/2,718</w:t>
+            </w:r>
+          </w:p>
+        </w:tc>
+        <w:tc>
+          <w:tcPr/>
+          <w:p>
+            <w:pPr>
+              <w:pStyle w:val="Compact"/>
+              <w:jc w:val="right"/>
+            </w:pPr>
+            <w:r>
+              <w:t xml:space="preserve">32.4%</w:t>
+            </w:r>
+          </w:p>
+        </w:tc>
+      </w:tr>
+      <w:tr>
+        <w:tc>
+          <w:tcPr/>
+          <w:p>
+            <w:pPr>
+              <w:pStyle w:val="Compact"/>
+            </w:pPr>
+            <w:r>
+              <w:t xml:space="preserve">Event accounting</w:t>
+            </w:r>
+          </w:p>
+        </w:tc>
+        <w:tc>
+          <w:tcPr/>
+          <w:p>
+            <w:pPr>
+              <w:pStyle w:val="Compact"/>
+            </w:pPr>
+            <w:r>
+              <w:t xml:space="preserve">likely genuine, unverified small indel</w:t>
+            </w:r>
+          </w:p>
+        </w:tc>
+        <w:tc>
+          <w:tcPr/>
+          <w:p>
+            <w:pPr>
+              <w:pStyle w:val="Compact"/>
+              <w:jc w:val="right"/>
+            </w:pPr>
+            <w:r>
+              <w:t xml:space="preserve">159/2,718</w:t>
+            </w:r>
+          </w:p>
+        </w:tc>
+        <w:tc>
+          <w:tcPr/>
+          <w:p>
+            <w:pPr>
+              <w:pStyle w:val="Compact"/>
+              <w:jc w:val="right"/>
+            </w:pPr>
+            <w:r>
+              <w:t xml:space="preserve">5.8%</w:t>
+            </w:r>
+          </w:p>
+        </w:tc>
+      </w:tr>
+    </w:tbl>
+    <w:p>
+      <w:pPr>
+        <w:pStyle w:val="BodyText"/>
+      </w:pPr>
+      <w:r>
+        <w:t xml:space="preserve">These very-high-ANI reference-genome pairs are not interpreted as inferred</w:t>
+      </w:r>
+      <w:r>
+        <w:t xml:space="preserve"> </w:t>
+      </w:r>
+      <w:r>
+        <w:t xml:space="preserve">outbreak or transmission clusters.</w:t>
+      </w:r>
+    </w:p>
+    <w:bookmarkEnd w:id="30"/>
+    <w:bookmarkStart w:id="31" w:name="Xe280e63292e65e7cc12ffc5dad24d6a06d19d0f"/>
+    <w:p>
+      <w:pPr>
+        <w:pStyle w:val="Heading2"/>
+      </w:pPr>
+      <w:r>
         <w:t xml:space="preserve">Supplementary Note 1 — Calibration is input-regime-specific (MAG test)</w:t>
       </w:r>
     </w:p>
@@ -4900,8 +6506,8 @@
         <w:t xml:space="preserve">.</w:t>
       </w:r>
     </w:p>
-    <w:bookmarkEnd w:id="29"/>
-    <w:bookmarkStart w:id="30" w:name="Xd013ccaae7d4dde06816ab37078854f863f6c97"/>
+    <w:bookmarkEnd w:id="31"/>
+    <w:bookmarkStart w:id="32" w:name="Xd013ccaae7d4dde06816ab37078854f863f6c97"/>
     <w:p>
       <w:pPr>
         <w:pStyle w:val="Heading2"/>
@@ -5072,8 +6678,8 @@
         <w:t xml:space="preserve">further is not expected to improve it (main text, Methods 4.6).</w:t>
       </w:r>
     </w:p>
-    <w:bookmarkEnd w:id="30"/>
-    <w:bookmarkStart w:id="31" w:name="X335171f238bd89d569aec4e4b5b6643057b0b49"/>
+    <w:bookmarkEnd w:id="32"/>
+    <w:bookmarkStart w:id="33" w:name="X335171f238bd89d569aec4e4b5b6643057b0b49"/>
     <w:p>
       <w:pPr>
         <w:pStyle w:val="Heading2"/>
@@ -5174,8 +6780,8 @@
         <w:t xml:space="preserve">.</w:t>
       </w:r>
     </w:p>
-    <w:bookmarkEnd w:id="31"/>
-    <w:bookmarkStart w:id="32" w:name="Xfd6529be4a0d1bbd51b24452f2b6f26ebe262a9"/>
+    <w:bookmarkEnd w:id="33"/>
+    <w:bookmarkStart w:id="34" w:name="Xfd6529be4a0d1bbd51b24452f2b6f26ebe262a9"/>
     <w:p>
       <w:pPr>
         <w:pStyle w:val="Heading2"/>
@@ -5951,8 +7557,8 @@
         <w:t xml:space="preserve">mid-ANI 0.343 vs 1.113), at a disclosed cost in near-clonal sensitivity.</w:t>
       </w:r>
     </w:p>
-    <w:bookmarkEnd w:id="32"/>
-    <w:bookmarkStart w:id="33" w:name="X39919e213b71580968f061584f61586905cff88"/>
+    <w:bookmarkEnd w:id="34"/>
+    <w:bookmarkStart w:id="35" w:name="X39919e213b71580968f061584f61586905cff88"/>
     <w:p>
       <w:pPr>
         <w:pStyle w:val="Heading2"/>
@@ -6081,8 +7687,8 @@
         <w:t xml:space="preserve">the real-genome correction layer.</w:t>
       </w:r>
     </w:p>
-    <w:bookmarkEnd w:id="33"/>
-    <w:bookmarkStart w:id="34" w:name="Xb1eb0d0077db50146ab5cb7a6cc963413c0d2d3"/>
+    <w:bookmarkEnd w:id="35"/>
+    <w:bookmarkStart w:id="36" w:name="Xb1eb0d0077db50146ab5cb7a6cc963413c0d2d3"/>
     <w:p>
       <w:pPr>
         <w:pStyle w:val="Heading2"/>
@@ -6472,6 +8078,84 @@
       </w:r>
       <w:r>
         <w:t xml:space="preserve">extrapolating.</w:t>
+      </w:r>
+    </w:p>
+    <w:p>
+      <w:pPr>
+        <w:pStyle w:val="BodyText"/>
+      </w:pPr>
+      <w:r>
+        <w:rPr>
+          <w:b/>
+          <w:bCs/>
+        </w:rPr>
+        <w:t xml:space="preserve">Model versions.</w:t>
+      </w:r>
+      <w:r>
+        <w:t xml:space="preserve"> </w:t>
+      </w:r>
+      <w:r>
+        <w:t xml:space="preserve">v5 is the deployed model embedded in the Syn2bANI 0.1.0</w:t>
+      </w:r>
+      <w:r>
+        <w:t xml:space="preserve"> </w:t>
+      </w:r>
+      <w:r>
+        <w:t xml:space="preserve">snapshot and is trained on the 2,520 pairs described above. Benchmark</w:t>
+      </w:r>
+      <w:r>
+        <w:t xml:space="preserve"> </w:t>
+      </w:r>
+      <w:r>
+        <w:t xml:space="preserve">calibration v6 uses the same ridge feature set and selection protocol, but adds</w:t>
+      </w:r>
+      <w:r>
+        <w:t xml:space="preserve"> </w:t>
+      </w:r>
+      <w:r>
+        <w:t xml:space="preserve">1,614 usable pairs from the high-ANI training split (1,615 sampled; one pair was</w:t>
+      </w:r>
+      <w:r>
+        <w:t xml:space="preserve"> </w:t>
+      </w:r>
+      <w:r>
+        <w:t xml:space="preserve">dropped for non-finite model features), for</w:t>
+      </w:r>
+      <w:r>
+        <w:t xml:space="preserve"> </w:t>
+      </w:r>
+      <w:r>
+        <w:rPr>
+          <w:rStyle w:val="VerbatimChar"/>
+        </w:rPr>
+        <w:t xml:space="preserve">training_n = 4,134</w:t>
+      </w:r>
+      <w:r>
+        <w:t xml:space="preserve">. High-ANI</w:t>
+      </w:r>
+      <w:r>
+        <w:t xml:space="preserve"> </w:t>
+      </w:r>
+      <w:r>
+        <w:t xml:space="preserve">candidate genomes were excluded bidirectionally from the v5 training genomes and</w:t>
+      </w:r>
+      <w:r>
+        <w:t xml:space="preserve"> </w:t>
+      </w:r>
+      <w:r>
+        <w:t xml:space="preserve">from all genomes in the 43,334-pair hold-out before genome-level train/test</w:t>
+      </w:r>
+      <w:r>
+        <w:t xml:space="preserve"> </w:t>
+      </w:r>
+      <w:r>
+        <w:t xml:space="preserve">assignment. Thus the held-out benchmark and the separate 727-pair high-ANI test</w:t>
+      </w:r>
+      <w:r>
+        <w:t xml:space="preserve"> </w:t>
+      </w:r>
+      <w:r>
+        <w:t xml:space="preserve">split are independent of v6 training.</w:t>
       </w:r>
     </w:p>
     <w:p>
@@ -7038,8 +8722,8 @@
         <w:t xml:space="preserve">not sensitive to the exact threshold in the 97–99% window.</w:t>
       </w:r>
     </w:p>
-    <w:bookmarkEnd w:id="34"/>
-    <w:bookmarkStart w:id="35" w:name="X59d740001b6791abdcf4dea327c946dcfbb2e56"/>
+    <w:bookmarkEnd w:id="36"/>
+    <w:bookmarkStart w:id="37" w:name="X59d740001b6791abdcf4dea327c946dcfbb2e56"/>
     <w:p>
       <w:pPr>
         <w:pStyle w:val="Heading2"/>
@@ -7704,8 +9388,8 @@
         <w:t xml:space="preserve">spacing (~15 kb for the default four-enzyme panel).</w:t>
       </w:r>
     </w:p>
-    <w:bookmarkEnd w:id="35"/>
-    <w:bookmarkEnd w:id="36"/>
+    <w:bookmarkEnd w:id="37"/>
+    <w:bookmarkEnd w:id="38"/>
     <w:sectPr>
       <w:footnotePr>
         <w:numRestart w:val="eachSect"/>

</xml_diff>

<commit_message>
Apply second Nature review revisions
</commit_message>
<xml_diff>
--- a/paper/manuscript/SUPPLEMENTARY.docx
+++ b/paper/manuscript/SUPPLEMENTARY.docx
@@ -277,13 +277,13 @@
       </w:r>
     </w:p>
     <w:bookmarkEnd w:id="11"/>
-    <w:bookmarkStart w:id="12" w:name="X9c05ab7676dba1214c8a6507a30270464495a16"/>
+    <w:bookmarkStart w:id="12" w:name="X285b8ca257357cbda733767e29ff50418cacd81"/>
     <w:p>
       <w:pPr>
         <w:pStyle w:val="Heading2"/>
       </w:pPr>
       <w:r>
-        <w:t xml:space="preserve">Supplementary Figure S4 — Genome quality does not drive ANI error on GTDB-R207</w:t>
+        <w:t xml:space="preserve">Supplementary Figure S4 — Common quality variation has little association with GTDB-R207 ANI error, but extreme fragmentation does</w:t>
       </w:r>
     </w:p>
     <w:p>
@@ -5656,13 +5656,73 @@
         <w:t xml:space="preserve"> </w:t>
       </w:r>
       <w:r>
-        <w:t xml:space="preserve">validation and orientation/rotation-artifact review. Pair-level and event-level</w:t>
-      </w:r>
-      <w:r>
-        <w:t xml:space="preserve"> </w:t>
-      </w:r>
-      <w:r>
-        <w:t xml:space="preserve">source data are in</w:t>
+        <w:t xml:space="preserve">validation and orientation/rotation-artifact review. Pair classification used</w:t>
+      </w:r>
+      <w:r>
+        <w:t xml:space="preserve"> </w:t>
+      </w:r>
+      <w:r>
+        <w:t xml:space="preserve">the reference chromosome only: minus-strand aligned fraction &gt;0.8 defined global</w:t>
+      </w:r>
+      <w:r>
+        <w:t xml:space="preserve"> </w:t>
+      </w:r>
+      <w:r>
+        <w:t xml:space="preserve">flip/rotation, 0.2–0.8 defined partial inversion, and ≤0.2 defined</w:t>
+      </w:r>
+      <w:r>
+        <w:t xml:space="preserve"> </w:t>
+      </w:r>
+      <w:r>
+        <w:t xml:space="preserve">collinear/local. An INV/TRA was accepted as genuine when at least 50% of its</w:t>
+      </w:r>
+      <w:r>
+        <w:t xml:space="preserve"> </w:t>
+      </w:r>
+      <w:r>
+        <w:t xml:space="preserve">span overlapped minus-strand alignment zones, or plus-strand zones in a flipped</w:t>
+      </w:r>
+      <w:r>
+        <w:t xml:space="preserve"> </w:t>
+      </w:r>
+      <w:r>
+        <w:t xml:space="preserve">background; otherwise it was called an artifact if either endpoint lay within</w:t>
+      </w:r>
+      <w:r>
+        <w:t xml:space="preserve"> </w:t>
+      </w:r>
+      <w:r>
+        <w:t xml:space="preserve">2 kb of an alignment-block boundary and the pair had &gt;4 blocks. A chromosomal</w:t>
+      </w:r>
+      <w:r>
+        <w:t xml:space="preserve"> </w:t>
+      </w:r>
+      <w:r>
+        <w:t xml:space="preserve">INS/DEL was genuine when minimap2 cs-tag parsing supported an indel of at least</w:t>
+      </w:r>
+      <w:r>
+        <w:t xml:space="preserve"> </w:t>
+      </w:r>
+      <w:r>
+        <w:t xml:space="preserve">1 kb within 3 kb of the call; off-chromosome content differences were genuine,</w:t>
+      </w:r>
+      <w:r>
+        <w:t xml:space="preserve"> </w:t>
+      </w:r>
+      <w:r>
+        <w:t xml:space="preserve">and smaller chromosomal indels were retained as likely genuine but unverified.</w:t>
+      </w:r>
+      <w:r>
+        <w:t xml:space="preserve"> </w:t>
+      </w:r>
+      <w:r>
+        <w:t xml:space="preserve">Genotype discordance was the measured AMR outcome; phenotype and expression were</w:t>
+      </w:r>
+      <w:r>
+        <w:t xml:space="preserve"> </w:t>
+      </w:r>
+      <w:r>
+        <w:t xml:space="preserve">not tested. Pair-level and event-level source data are in</w:t>
       </w:r>
       <w:r>
         <w:t xml:space="preserve"> </w:t>
@@ -7885,7 +7945,19 @@
         <w:t xml:space="preserve"> </w:t>
       </w:r>
       <w:r>
-        <w:t xml:space="preserve">with the original 2,074-pair set.</w:t>
+        <w:t xml:space="preserve">with the original 2,074-pair set. Thus 21 of the nominal 2,074 source pairs</w:t>
+      </w:r>
+      <w:r>
+        <w:t xml:space="preserve"> </w:t>
+      </w:r>
+      <w:r>
+        <w:t xml:space="preserve">lacked finite v5 training features and were not used; all provenance and</w:t>
+      </w:r>
+      <w:r>
+        <w:t xml:space="preserve"> </w:t>
+      </w:r>
+      <w:r>
+        <w:t xml:space="preserve">manuscript accounting reports the finite training total of 2,520 pairs.</w:t>
       </w:r>
     </w:p>
     <w:p>
@@ -8173,7 +8245,13 @@
         <w:t xml:space="preserve"> </w:t>
       </w:r>
       <w:r>
-        <w:t xml:space="preserve">The raw gated estimate is more accurate than the</w:t>
+        <w:t xml:space="preserve">This is a post-benchmark selection audit, not an</w:t>
+      </w:r>
+      <w:r>
+        <w:t xml:space="preserve"> </w:t>
+      </w:r>
+      <w:r>
+        <w:t xml:space="preserve">independent evaluation of threshold choice. The raw gated estimate is more accurate than the</w:t>
       </w:r>
       <w:r>
         <w:t xml:space="preserve"> </w:t>
@@ -8719,7 +8797,25 @@
         <w:t xml:space="preserve"> </w:t>
       </w:r>
       <w:r>
-        <w:t xml:space="preserve">not sensitive to the exact threshold in the 97–99% window.</w:t>
+        <w:t xml:space="preserve">not sensitive to the exact threshold in the 97–99% window. Because selection and</w:t>
+      </w:r>
+      <w:r>
+        <w:t xml:space="preserve"> </w:t>
+      </w:r>
+      <w:r>
+        <w:t xml:space="preserve">evaluation use the same complete-case set, the corresponding Table 1 unified row</w:t>
+      </w:r>
+      <w:r>
+        <w:t xml:space="preserve"> </w:t>
+      </w:r>
+      <w:r>
+        <w:t xml:space="preserve">is an operational-threshold sensitivity analysis; the confirmatory claims are</w:t>
+      </w:r>
+      <w:r>
+        <w:t xml:space="preserve"> </w:t>
+      </w:r>
+      <w:r>
+        <w:t xml:space="preserve">the genome-disjoint raw and v6-calibrated results.</w:t>
       </w:r>
     </w:p>
     <w:bookmarkEnd w:id="36"/>

</xml_diff>